<commit_message>
docs(thesis): clean DOI fields from references in opening report docx
Why:
广州工商学院本科毕业论文（设计）开题报告参考文献采用 GB/T 7714 顺序编码制标准，纸质/传统申报表格式要求参考文献不得包含冗长的 DOI 电子标识符及后续内容，需统一清洗以符合学校毕业论文管理与格式审查规范。

What:
- 广州工商学院本科毕业论文（设计）开题报告_修改版.docx: 针对文末参考文献列表（第 57 至 80 段，共 24 篇文献），彻底清洗末尾的 'DOI: ...' 内容，统一以英文句号 '.' 结尾。
- 完整保留 Times New Roman / 宋体（五号 10.5pt）、1.5 倍行距及段落对齐格式，不破坏表格整体布局。

Verification:
- 自动化脚本核验 24 篇文献中 0 处 DOI 残留，全部正确以句点收尾。
- 正文 21 处文献上标引用（[1-2] 到 [24]）对应关系完好无损。
- 本地自动化测试全量执行通过: uv run pytest -v tests/ (198 passed, 1 warning)。
</commit_message>
<xml_diff>
--- a/广州工商学院本科毕业论文（设计）开题报告_修改版.docx
+++ b/广州工商学院本科毕业论文（设计）开题报告_修改版.docx
@@ -3394,7 +3394,7 @@
                 <w:rFonts w:ascii="Times New Roman" w:hAnsi="Times New Roman" w:eastAsia="宋体"/>
                 <w:sz w:val="21"/>
               </w:rPr>
-              <w:t>[1] SONG L, YU G, YUAN J, et al. Human pose estimation and its application to action recognition: A survey[J]. Journal of Visual Communication and Image Representation, 2021, 76: 103055. DOI: 10.1016/j.jvcir.2021.103055.</w:t>
+              <w:t>[1] SONG L, YU G, YUAN J, et al. Human pose estimation and its application to action recognition: A survey[J]. Journal of Visual Communication and Image Representation, 2021, 76: 103055.</w:t>
             </w:r>
           </w:p>
           <w:p>
@@ -3412,7 +3412,7 @@
                 <w:rFonts w:ascii="Times New Roman" w:hAnsi="Times New Roman" w:eastAsia="宋体"/>
                 <w:sz w:val="21"/>
               </w:rPr>
-              <w:t>[2] FU H, GAO J, LIU H. Human pose estimation and action recognition for fitness movements[J]. Computers &amp; Graphics, 2023, 116: 418-426. DOI: 10.1016/j.cag.2023.09.008.</w:t>
+              <w:t>[2] FU H, GAO J, LIU H. Human pose estimation and action recognition for fitness movements[J]. Computers &amp; Graphics, 2023, 116: 418-426.</w:t>
             </w:r>
           </w:p>
           <w:p>
@@ -3430,7 +3430,7 @@
                 <w:rFonts w:ascii="Times New Roman" w:hAnsi="Times New Roman" w:eastAsia="宋体"/>
                 <w:sz w:val="21"/>
               </w:rPr>
-              <w:t>[3] 张宇, 温光照, 米思娅, 等. 基于深度学习的二维人体姿态估计综述[J]. 软件学报, 2022, 33(11): 4173-4191. DOI: 10.13328/j.cnki.jos.006390.</w:t>
+              <w:t>[3] 张宇, 温光照, 米思娅, 等. 基于深度学习的二维人体姿态估计综述[J]. 软件学报, 2022, 33(11): 4173-4191.</w:t>
             </w:r>
           </w:p>
           <w:p>
@@ -3448,7 +3448,7 @@
                 <w:rFonts w:ascii="Times New Roman" w:hAnsi="Times New Roman" w:eastAsia="宋体"/>
                 <w:sz w:val="21"/>
               </w:rPr>
-              <w:t>[4] 孙琪翔, 何宁, 张敬尊, 等. 基于非局部高分辨率网络的轻量化人体姿态估计方法[J]. 计算机应用, 2022, 42(5): 1398-1406. DOI: 10.11772/j.issn.1001-9081.2021030512.</w:t>
+              <w:t>[4] 孙琪翔, 何宁, 张敬尊, 等. 基于非局部高分辨率网络的轻量化人体姿态估计方法[J]. 计算机应用, 2022, 42(5): 1398-1406.</w:t>
             </w:r>
           </w:p>
           <w:p>
@@ -3466,7 +3466,7 @@
                 <w:rFonts w:ascii="Times New Roman" w:hAnsi="Times New Roman" w:eastAsia="宋体"/>
                 <w:sz w:val="21"/>
               </w:rPr>
-              <w:t>[5] 王名赫, 徐望明, 蒋昊坤. 一种改进的轻量级人体姿态估计算法[J]. 液晶与显示, 2023, 38(7): 955-963. DOI: 10.37188/CJLCD.2022-0323.</w:t>
+              <w:t>[5] 王名赫, 徐望明, 蒋昊坤. 一种改进的轻量级人体姿态估计算法[J]. 液晶与显示, 2023, 38(7): 955-963.</w:t>
             </w:r>
           </w:p>
           <w:p>
@@ -3484,7 +3484,7 @@
                 <w:rFonts w:ascii="Times New Roman" w:hAnsi="Times New Roman" w:eastAsia="宋体"/>
                 <w:sz w:val="21"/>
               </w:rPr>
-              <w:t>[6] 毋宁, 王鹏, 李晓艳, 等. 基于自适应特征感知的轻量化人体姿态估计[J]. 液晶与显示, 2023, 38(8): 1107-1117. DOI: 10.37188/CJLCD.2022-0351.</w:t>
+              <w:t>[6] 毋宁, 王鹏, 李晓艳, 等. 基于自适应特征感知的轻量化人体姿态估计[J]. 液晶与显示, 2023, 38(8): 1107-1117.</w:t>
             </w:r>
           </w:p>
           <w:p>
@@ -3502,7 +3502,7 @@
                 <w:rFonts w:ascii="Times New Roman" w:hAnsi="Times New Roman" w:eastAsia="宋体"/>
                 <w:sz w:val="21"/>
               </w:rPr>
-              <w:t>[7] 杨飞宇, 宋展, 肖振中, 等. 对人体姿态估计热图误差的再思考[J]. 计算机应用, 2022, 42(8): 2548-2555. DOI: 10.11772/j.issn.1001-9081.2021050805.</w:t>
+              <w:t>[7] 杨飞宇, 宋展, 肖振中, 等. 对人体姿态估计热图误差的再思考[J]. 计算机应用, 2022, 42(8): 2548-2555.</w:t>
             </w:r>
           </w:p>
           <w:p>
@@ -3538,7 +3538,7 @@
                 <w:rFonts w:ascii="Times New Roman" w:hAnsi="Times New Roman" w:eastAsia="宋体"/>
                 <w:sz w:val="21"/>
               </w:rPr>
-              <w:t>[9] ZHENG C, ZHU S, MENDIETA M, et al. 3D human pose estimation with spatial and temporal transformers[C]//Proceedings of the IEEE/CVF International Conference on Computer Vision. 2021: 11656-11665. DOI: 10.1109/ICCV48922.2021.01145.</w:t>
+              <w:t>[9] ZHENG C, ZHU S, MENDIETA M, et al. 3D human pose estimation with spatial and temporal transformers[C]//Proceedings of the IEEE/CVF International Conference on Computer Vision. 2021: 11656-11665.</w:t>
             </w:r>
           </w:p>
           <w:p>
@@ -3556,7 +3556,7 @@
                 <w:rFonts w:ascii="Times New Roman" w:hAnsi="Times New Roman" w:eastAsia="宋体"/>
                 <w:sz w:val="21"/>
               </w:rPr>
-              <w:t>[10] XING Y, ZHU J. Deep learning-based action recognition with 3D skeleton: A survey[J]. CAAI Transactions on Intelligence Technology, 2021, 6(1): 80-92. DOI: 10.1049/cit2.12014.</w:t>
+              <w:t>[10] XING Y, ZHU J. Deep learning-based action recognition with 3D skeleton: A survey[J]. CAAI Transactions on Intelligence Technology, 2021, 6(1): 80-92.</w:t>
             </w:r>
           </w:p>
           <w:p>
@@ -3574,7 +3574,7 @@
                 <w:rFonts w:ascii="Times New Roman" w:hAnsi="Times New Roman" w:eastAsia="宋体"/>
                 <w:sz w:val="21"/>
               </w:rPr>
-              <w:t>[11] 李扬志, 袁家政, 刘宏哲. 基于时空注意力图卷积网络模型的人体骨架动作识别算法[J]. 计算机应用, 2021, 41(7): 1915-1921. DOI: 10.11772/j.issn.1001-9081.2020091515.</w:t>
+              <w:t>[11] 李扬志, 袁家政, 刘宏哲. 基于时空注意力图卷积网络模型的人体骨架动作识别算法[J]. 计算机应用, 2021, 41(7): 1915-1921.</w:t>
             </w:r>
           </w:p>
           <w:p>
@@ -3592,7 +3592,7 @@
                 <w:rFonts w:ascii="Times New Roman" w:hAnsi="Times New Roman" w:eastAsia="宋体"/>
                 <w:sz w:val="21"/>
               </w:rPr>
-              <w:t>[12] 吕淑平, 黄毅, 王莹莹. 基于C3D卷积神经网络人体动作识别方法改进[J]. 实验技术与管理, 2021, 38(10): 168-171, 176. DOI: 10.16791/j.cnki.sjg.2021.10.031.</w:t>
+              <w:t>[12] 吕淑平, 黄毅, 王莹莹. 基于C3D卷积神经网络人体动作识别方法改进[J]. 实验技术与管理, 2021, 38(10): 168-171, 176.</w:t>
             </w:r>
           </w:p>
           <w:p>
@@ -3610,7 +3610,7 @@
                 <w:rFonts w:ascii="Times New Roman" w:hAnsi="Times New Roman" w:eastAsia="宋体"/>
                 <w:sz w:val="21"/>
               </w:rPr>
-              <w:t>[13] 蒋韦晔, 刘成明. 基于深度图的人体动作分类自适应算法[J]. 郑州大学学报(理学版), 2021, 53(1): 16-21. DOI: 10.13705/j.issn.1671-6841.2019584.</w:t>
+              <w:t>[13] 蒋韦晔, 刘成明. 基于深度图的人体动作分类自适应算法[J]. 郑州大学学报(理学版), 2021, 53(1): 16-21.</w:t>
             </w:r>
           </w:p>
           <w:p>
@@ -3628,7 +3628,7 @@
                 <w:rFonts w:ascii="Times New Roman" w:hAnsi="Times New Roman" w:eastAsia="宋体"/>
                 <w:sz w:val="21"/>
               </w:rPr>
-              <w:t>[14] 李豆豆, 李汪根, 夏义春, 等. 基于特征交互与自适应融合的骨骼动作识别[J]. 计算机应用, 2023, 43(8): 2581-2587. DOI: 10.11772/j.issn.1001-9081.2022071105.</w:t>
+              <w:t>[14] 李豆豆, 李汪根, 夏义春, 等. 基于特征交互与自适应融合的骨骼动作识别[J]. 计算机应用, 2023, 43(8): 2581-2587.</w:t>
             </w:r>
           </w:p>
           <w:p>
@@ -3646,7 +3646,7 @@
                 <w:rFonts w:ascii="Times New Roman" w:hAnsi="Times New Roman" w:eastAsia="宋体"/>
                 <w:sz w:val="21"/>
               </w:rPr>
-              <w:t>[15] THILAKARATHNE H, NIBALI A, HE Z, et al. Pose is all you need: The pose only group activity recognition system (POGARS)[J]. Machine Vision and Applications, 2022, 33: 95. DOI: 10.1007/s00138-022-01346-2.</w:t>
+              <w:t>[15] THILAKARATHNE H, NIBALI A, HE Z, et al. Pose is all you need: The pose only group activity recognition system (POGARS)[J]. Machine Vision and Applications, 2022, 33: 95.</w:t>
             </w:r>
           </w:p>
           <w:p>
@@ -3664,7 +3664,7 @@
                 <w:rFonts w:ascii="Times New Roman" w:hAnsi="Times New Roman" w:eastAsia="宋体"/>
                 <w:sz w:val="21"/>
               </w:rPr>
-              <w:t>[16] DUAN H, ZHAO Y, CHEN K, et al. Revisiting skeleton-based action recognition[C]//Proceedings of the IEEE/CVF Conference on Computer Vision and Pattern Recognition. 2022: 2959-2968. DOI: 10.1109/CVPR52688.2022.00298.</w:t>
+              <w:t>[16] DUAN H, ZHAO Y, CHEN K, et al. Revisiting skeleton-based action recognition[C]//Proceedings of the IEEE/CVF Conference on Computer Vision and Pattern Recognition. 2022: 2959-2968.</w:t>
             </w:r>
           </w:p>
           <w:p>
@@ -3682,7 +3682,7 @@
                 <w:rFonts w:ascii="Times New Roman" w:hAnsi="Times New Roman" w:eastAsia="宋体"/>
                 <w:sz w:val="21"/>
               </w:rPr>
-              <w:t>[17] LIU M, MENG F, CHEN C, et al. Novel motion patterns matter for practical skeleton-based action recognition[C]//Proceedings of the AAAI Conference on Artificial Intelligence. 2023, 37(2): 1701-1709. DOI: 10.1609/aaai.v37i2.25258.</w:t>
+              <w:t>[17] LIU M, MENG F, CHEN C, et al. Novel motion patterns matter for practical skeleton-based action recognition[C]//Proceedings of the AAAI Conference on Artificial Intelligence. 2023, 37(2): 1701-1709.</w:t>
             </w:r>
           </w:p>
           <w:p>
@@ -3700,7 +3700,7 @@
                 <w:rFonts w:ascii="Times New Roman" w:hAnsi="Times New Roman" w:eastAsia="宋体"/>
                 <w:sz w:val="21"/>
               </w:rPr>
-              <w:t>[18] ZHU W, MA X, LIU Z, et al. MotionBERT: A unified perspective on learning human motion representations[C]//Proceedings of the IEEE/CVF International Conference on Computer Vision. 2023: 15085-15099. DOI: 10.1109/ICCV51070.2023.01385.</w:t>
+              <w:t>[18] ZHU W, MA X, LIU Z, et al. MotionBERT: A unified perspective on learning human motion representations[C]//Proceedings of the IEEE/CVF International Conference on Computer Vision. 2023: 15085-15099.</w:t>
             </w:r>
           </w:p>
           <w:p>
@@ -3718,7 +3718,7 @@
                 <w:rFonts w:ascii="Times New Roman" w:hAnsi="Times New Roman" w:eastAsia="宋体"/>
                 <w:sz w:val="21"/>
               </w:rPr>
-              <w:t>[19] PAOLETTI G, BEYAN C, DEL BUE A. SKELTER: Unsupervised skeleton action denoising and recognition using transformers[J]. Frontiers in Computer Science, 2023, 5: 1203901. DOI: 10.3389/fcomp.2023.1203901.</w:t>
+              <w:t>[19] PAOLETTI G, BEYAN C, DEL BUE A. SKELTER: Unsupervised skeleton action denoising and recognition using transformers[J]. Frontiers in Computer Science, 2023, 5: 1203901.</w:t>
             </w:r>
           </w:p>
           <w:p>
@@ -3736,7 +3736,7 @@
                 <w:rFonts w:ascii="Times New Roman" w:hAnsi="Times New Roman" w:eastAsia="宋体"/>
                 <w:sz w:val="21"/>
               </w:rPr>
-              <w:t>[20] 蔡敏敏, 黄继风, 林晓, 等. 基于人体姿态估计与聚类的特定运动帧获取方法[J]. 图学学报, 2022, 43(1): 44-52. DOI: 10.11996/JG.j.2095-302X.2022010044.</w:t>
+              <w:t>[20] 蔡敏敏, 黄继风, 林晓, 等. 基于人体姿态估计与聚类的特定运动帧获取方法[J]. 图学学报, 2022, 43(1): 44-52.</w:t>
             </w:r>
           </w:p>
           <w:p>
@@ -3754,7 +3754,7 @@
                 <w:rFonts w:ascii="Times New Roman" w:hAnsi="Times New Roman" w:eastAsia="宋体"/>
                 <w:sz w:val="21"/>
               </w:rPr>
-              <w:t>[21] 蔡兴泉, 霍宇晴, 李发建, 等. 面向太极拳学习的人体姿态估计及相似度计算[J]. 图学学报, 2022, 43(4): 695-706. DOI: 10.11996/JG.j.2095-302X.2022040695.</w:t>
+              <w:t>[21] 蔡兴泉, 霍宇晴, 李发建, 等. 面向太极拳学习的人体姿态估计及相似度计算[J]. 图学学报, 2022, 43(4): 695-706.</w:t>
             </w:r>
           </w:p>
           <w:p>
@@ -3772,7 +3772,7 @@
                 <w:rFonts w:ascii="Times New Roman" w:hAnsi="Times New Roman" w:eastAsia="宋体"/>
                 <w:sz w:val="21"/>
               </w:rPr>
-              <w:t>[22] 李晟, 宋可儿, 欧阳柏强, 等. 基于人体姿态识别的立定跳远动作智能评估系统[J]. 人工智能, 2022(2): 75-87. DOI: 10.16453/j.cnki.ISSN2096-5036.2022.02.009.</w:t>
+              <w:t>[22] 李晟, 宋可儿, 欧阳柏强, 等. 基于人体姿态识别的立定跳远动作智能评估系统[J]. 人工智能, 2022(2): 75-87.</w:t>
             </w:r>
           </w:p>
           <w:p>
@@ -3808,7 +3808,7 @@
                 <w:rFonts w:ascii="Times New Roman" w:hAnsi="Times New Roman" w:eastAsia="宋体"/>
                 <w:sz w:val="21"/>
               </w:rPr>
-              <w:t>[24] NANDAGOPAL S, KARTHY G, OLIVER A S, et al. Optimal deep convolutional neural network with pose estimation for human activity recognition[J]. Computer Systems Science and Engineering, 2023, 44(2): 1719-1733. DOI: 10.32604/csse.2023.028003.</w:t>
+              <w:t>[24] NANDAGOPAL S, KARTHY G, OLIVER A S, et al. Optimal deep convolutional neural network with pose estimation for human activity recognition[J]. Computer Systems Science and Engineering, 2023, 44(2): 1719-1733.</w:t>
             </w:r>
           </w:p>
         </w:tc>

</xml_diff>